<commit_message>
ajouts infos sur lentilles dans ma partie
</commit_message>
<xml_diff>
--- a/ETRE/Lunettes_vs_lentilles/lentilleslunettesElora.docx
+++ b/ETRE/Lunettes_vs_lentilles/lentilleslunettesElora.docx
@@ -19,6 +19,9 @@
     <w:p/>
     <w:p>
       <w:r>
+        <w:rPr>
+          <w:noProof/>
+        </w:rPr>
         <w:drawing>
           <wp:inline distT="0" distB="0" distL="0" distR="0" wp14:anchorId="3CE27650" wp14:editId="07703DA4">
             <wp:extent cx="5760720" cy="3603625"/>
@@ -169,15 +172,7 @@
         <w:pStyle w:val="Paragraphedeliste"/>
       </w:pPr>
       <w:r>
-        <w:t xml:space="preserve">Polycarbonate ou </w:t>
-      </w:r>
-      <w:proofErr w:type="spellStart"/>
-      <w:r>
-        <w:t>Trivex</w:t>
-      </w:r>
-      <w:proofErr w:type="spellEnd"/>
-      <w:r>
-        <w:t xml:space="preserve"> (plastiques)</w:t>
+        <w:t>Polycarbonate ou Trivex (plastiques)</w:t>
       </w:r>
     </w:p>
     <w:p>
@@ -197,15 +192,7 @@
         <w:t>Fin de vie : structures de réemploi des lunettes</w:t>
       </w:r>
       <w:r>
-        <w:t xml:space="preserve"> pour populations dans le besoin (ex : ordre de Malte, </w:t>
-      </w:r>
-      <w:proofErr w:type="spellStart"/>
-      <w:r>
-        <w:t>Recycl’Optics</w:t>
-      </w:r>
-      <w:proofErr w:type="spellEnd"/>
-      <w:r>
-        <w:t xml:space="preserve">) </w:t>
+        <w:t xml:space="preserve"> pour populations dans le besoin (ex : ordre de Malte, Recycl’Optics) </w:t>
       </w:r>
     </w:p>
     <w:p>
@@ -228,17 +215,8 @@
           <w:i/>
           <w:iCs/>
         </w:rPr>
-        <w:t xml:space="preserve">Etude </w:t>
-      </w:r>
-      <w:proofErr w:type="spellStart"/>
-      <w:r>
-        <w:rPr>
-          <w:i/>
-          <w:iCs/>
-        </w:rPr>
-        <w:t>OpinionWay</w:t>
-      </w:r>
-      <w:proofErr w:type="spellEnd"/>
+        <w:t>Etude OpinionWay</w:t>
+      </w:r>
       <w:r>
         <w:rPr>
           <w:b/>
@@ -250,6 +228,76 @@
         <w:t xml:space="preserve">  </w:t>
       </w:r>
     </w:p>
+    <w:p>
+      <w:pPr>
+        <w:pStyle w:val="Paragraphedeliste"/>
+      </w:pPr>
+    </w:p>
+    <w:p>
+      <w:pPr>
+        <w:rPr>
+          <w:b/>
+          <w:bCs/>
+        </w:rPr>
+      </w:pPr>
+      <w:r>
+        <w:rPr>
+          <w:b/>
+          <w:bCs/>
+        </w:rPr>
+        <w:t>Lentilles souples :</w:t>
+      </w:r>
+    </w:p>
+    <w:p/>
+    <w:p>
+      <w:hyperlink r:id="rId6" w:history="1">
+        <w:r>
+          <w:rPr>
+            <w:rStyle w:val="Lienhypertexte"/>
+          </w:rPr>
+          <w:t>https://www.ophtalmologie-biarritz-caliot-guin.com/wp-content/uploads/2020/05/Quels-produits-dentretien-pour-les-lentilles.pdf</w:t>
+        </w:r>
+      </w:hyperlink>
+    </w:p>
+    <w:p>
+      <w:pPr>
+        <w:pStyle w:val="Paragraphedeliste"/>
+        <w:numPr>
+          <w:ilvl w:val="0"/>
+          <w:numId w:val="1"/>
+        </w:numPr>
+      </w:pPr>
+      <w:r>
+        <w:t>Recense différents produits utilisables pour différentes lentilles, selon les matériaux et leur effet</w:t>
+      </w:r>
+    </w:p>
+    <w:p>
+      <w:r>
+        <w:t>Produit d’entretien multrifonction : environ 15€</w:t>
+      </w:r>
+    </w:p>
+    <w:p/>
+    <w:p>
+      <w:pPr>
+        <w:rPr>
+          <w:b/>
+          <w:bCs/>
+        </w:rPr>
+      </w:pPr>
+      <w:r>
+        <w:rPr>
+          <w:b/>
+          <w:bCs/>
+        </w:rPr>
+        <w:t>Lentilles rigides :</w:t>
+      </w:r>
+    </w:p>
+    <w:p>
+      <w:r>
+        <w:t>Produits d’entretien : Oxyclean 15€, Aquadrop 18€, enzymes 15€</w:t>
+      </w:r>
+    </w:p>
+    <w:p/>
     <w:sectPr>
       <w:pgSz w:w="11906" w:h="16838"/>
       <w:pgMar w:top="1417" w:right="1417" w:bottom="1417" w:left="1417" w:header="708" w:footer="708" w:gutter="0"/>
@@ -1100,6 +1148,7 @@
   <w:style w:type="character" w:default="1" w:styleId="Policepardfaut">
     <w:name w:val="Default Paragraph Font"/>
     <w:uiPriority w:val="1"/>
+    <w:semiHidden/>
     <w:unhideWhenUsed/>
   </w:style>
   <w:style w:type="table" w:default="1" w:styleId="TableauNormal">
@@ -1411,6 +1460,29 @@
       <w:smallCaps/>
       <w:color w:val="0F4761" w:themeColor="accent1" w:themeShade="BF"/>
       <w:spacing w:val="5"/>
+    </w:rPr>
+  </w:style>
+  <w:style w:type="character" w:styleId="Lienhypertexte">
+    <w:name w:val="Hyperlink"/>
+    <w:basedOn w:val="Policepardfaut"/>
+    <w:uiPriority w:val="99"/>
+    <w:unhideWhenUsed/>
+    <w:rsid w:val="000050C6"/>
+    <w:rPr>
+      <w:color w:val="467886" w:themeColor="hyperlink"/>
+      <w:u w:val="single"/>
+    </w:rPr>
+  </w:style>
+  <w:style w:type="character" w:styleId="Mentionnonrsolue">
+    <w:name w:val="Unresolved Mention"/>
+    <w:basedOn w:val="Policepardfaut"/>
+    <w:uiPriority w:val="99"/>
+    <w:semiHidden/>
+    <w:unhideWhenUsed/>
+    <w:rsid w:val="000050C6"/>
+    <w:rPr>
+      <w:color w:val="605E5C"/>
+      <w:shd w:val="clear" w:color="auto" w:fill="E1DFDD"/>
     </w:rPr>
   </w:style>
 </w:styles>

</xml_diff>